<commit_message>
add minor code explanations
</commit_message>
<xml_diff>
--- a/proposal/structure_final_datasets_sketch.docx
+++ b/proposal/structure_final_datasets_sketch.docx
@@ -1,6 +1,6 @@
 
 <file path=word/document.xml><?xml version="1.0" encoding="utf-8"?>
-<w:document xmlns:wpc="http://schemas.microsoft.com/office/word/2010/wordprocessingCanvas" xmlns:cx="http://schemas.microsoft.com/office/drawing/2014/chartex" xmlns:cx1="http://schemas.microsoft.com/office/drawing/2015/9/8/chartex" xmlns:cx2="http://schemas.microsoft.com/office/drawing/2015/10/21/chartex" xmlns:cx3="http://schemas.microsoft.com/office/drawing/2016/5/9/chartex" xmlns:cx4="http://schemas.microsoft.com/office/drawing/2016/5/10/chartex" xmlns:cx5="http://schemas.microsoft.com/office/drawing/2016/5/11/chartex" xmlns:cx6="http://schemas.microsoft.com/office/drawing/2016/5/12/chartex" xmlns:cx7="http://schemas.microsoft.com/office/drawing/2016/5/13/chartex" xmlns:cx8="http://schemas.microsoft.com/office/drawing/2016/5/14/chartex" xmlns:mc="http://schemas.openxmlformats.org/markup-compatibility/2006" xmlns:aink="http://schemas.microsoft.com/office/drawing/2016/ink" xmlns:am3d="http://schemas.microsoft.com/office/drawing/2017/model3d" xmlns:o="urn:schemas-microsoft-com:office:office" xmlns:oel="http://schemas.microsoft.com/office/2019/extlst" xmlns:r="http://schemas.openxmlformats.org/officeDocument/2006/relationships" xmlns:m="http://schemas.openxmlformats.org/officeDocument/2006/math" xmlns:v="urn:schemas-microsoft-com:vml" xmlns:wp14="http://schemas.microsoft.com/office/word/2010/wordprocessingDrawing" xmlns:wp="http://schemas.openxmlformats.org/drawingml/2006/wordprocessingDrawing" xmlns:w10="urn:schemas-microsoft-com:office:word" xmlns:w="http://schemas.openxmlformats.org/wordprocessingml/2006/main" xmlns:w14="http://schemas.microsoft.com/office/word/2010/wordml" xmlns:w15="http://schemas.microsoft.com/office/word/2012/wordml" xmlns:w16cex="http://schemas.microsoft.com/office/word/2018/wordml/cex" xmlns:w16cid="http://schemas.microsoft.com/office/word/2016/wordml/cid" xmlns:w16="http://schemas.microsoft.com/office/word/2018/wordml" xmlns:w16du="http://schemas.microsoft.com/office/word/2023/wordml/word16du" xmlns:w16sdtdh="http://schemas.microsoft.com/office/word/2020/wordml/sdtdatahash" xmlns:w16sdtfl="http://schemas.microsoft.com/office/word/2024/wordml/sdtformatlock" xmlns:w16se="http://schemas.microsoft.com/office/word/2015/wordml/symex" xmlns:wpg="http://schemas.microsoft.com/office/word/2010/wordprocessingGroup" xmlns:wpi="http://schemas.microsoft.com/office/word/2010/wordprocessingInk" xmlns:wne="http://schemas.microsoft.com/office/word/2006/wordml" xmlns:wps="http://schemas.microsoft.com/office/word/2010/wordprocessingShape" mc:Ignorable="w14 w15 w16se w16cid w16 w16cex w16sdtdh w16sdtfl w16du wp14">
+<w:document xmlns:wpc="http://schemas.microsoft.com/office/word/2010/wordprocessingCanvas" xmlns:cx="http://schemas.microsoft.com/office/drawing/2014/chartex" xmlns:cx1="http://schemas.microsoft.com/office/drawing/2015/9/8/chartex" xmlns:cx2="http://schemas.microsoft.com/office/drawing/2015/10/21/chartex" xmlns:cx3="http://schemas.microsoft.com/office/drawing/2016/5/9/chartex" xmlns:cx4="http://schemas.microsoft.com/office/drawing/2016/5/10/chartex" xmlns:cx5="http://schemas.microsoft.com/office/drawing/2016/5/11/chartex" xmlns:cx6="http://schemas.microsoft.com/office/drawing/2016/5/12/chartex" xmlns:cx7="http://schemas.microsoft.com/office/drawing/2016/5/13/chartex" xmlns:cx8="http://schemas.microsoft.com/office/drawing/2016/5/14/chartex" xmlns:mc="http://schemas.openxmlformats.org/markup-compatibility/2006" xmlns:aink="http://schemas.microsoft.com/office/drawing/2016/ink" xmlns:am3d="http://schemas.microsoft.com/office/drawing/2017/model3d" xmlns:o="urn:schemas-microsoft-com:office:office" xmlns:oel="http://schemas.microsoft.com/office/2019/extlst" xmlns:r="http://schemas.openxmlformats.org/officeDocument/2006/relationships" xmlns:m="http://schemas.openxmlformats.org/officeDocument/2006/math" xmlns:v="urn:schemas-microsoft-com:vml" xmlns:wp14="http://schemas.microsoft.com/office/word/2010/wordprocessingDrawing" xmlns:wp="http://schemas.openxmlformats.org/drawingml/2006/wordprocessingDrawing" xmlns:w10="urn:schemas-microsoft-com:office:word" xmlns:w="http://schemas.openxmlformats.org/wordprocessingml/2006/main" xmlns:w14="http://schemas.microsoft.com/office/word/2010/wordml" xmlns:w15="http://schemas.microsoft.com/office/word/2012/wordml" xmlns:w16cei="http://schemas.microsoft.com/office/word/2026/wordml/cei" xmlns:w16cex="http://schemas.microsoft.com/office/word/2018/wordml/cex" xmlns:w16cid="http://schemas.microsoft.com/office/word/2016/wordml/cid" xmlns:w16="http://schemas.microsoft.com/office/word/2018/wordml" xmlns:w16du="http://schemas.microsoft.com/office/word/2023/wordml/word16du" xmlns:w16sdtdh="http://schemas.microsoft.com/office/word/2020/wordml/sdtdatahash" xmlns:w16sdtfl="http://schemas.microsoft.com/office/word/2024/wordml/sdtformatlock" xmlns:w16se="http://schemas.microsoft.com/office/word/2015/wordml/symex" xmlns:wpg="http://schemas.microsoft.com/office/word/2010/wordprocessingGroup" xmlns:wpi="http://schemas.microsoft.com/office/word/2010/wordprocessingInk" xmlns:wne="http://schemas.microsoft.com/office/word/2006/wordml" xmlns:wps="http://schemas.microsoft.com/office/word/2010/wordprocessingShape" mc:Ignorable="w14 w15 w16se w16cid w16 w16cex w16sdtdh w16sdtfl w16du wp14">
   <w:body>
     <w:tbl>
       <w:tblPr>
@@ -202,13 +202,7 @@
               <w:rPr>
                 <w:lang w:val="de-CH"/>
               </w:rPr>
-              <w:t>C</w:t>
-            </w:r>
-            <w:r>
-              <w:rPr>
-                <w:lang w:val="de-CH"/>
-              </w:rPr>
-              <w:t>anton</w:t>
+              <w:t>Canton</w:t>
             </w:r>
             <w:proofErr w:type="spellEnd"/>
           </w:p>
@@ -232,67 +226,6 @@
               </w:rPr>
               <w:t>Needed for interpretation and canton comparisons</w:t>
             </w:r>
-          </w:p>
-        </w:tc>
-      </w:tr>
-      <w:tr>
-        <w:trPr>
-          <w:tblCellSpacing w:w="15" w:type="dxa"/>
-        </w:trPr>
-        <w:tc>
-          <w:tcPr>
-            <w:tcW w:w="0" w:type="auto"/>
-            <w:vAlign w:val="center"/>
-            <w:hideMark/>
-          </w:tcPr>
-          <w:p>
-            <w:pPr>
-              <w:pStyle w:val="StandardohneAbstand"/>
-              <w:rPr>
-                <w:lang w:val="de-CH"/>
-              </w:rPr>
-            </w:pPr>
-            <w:r>
-              <w:rPr>
-                <w:lang w:val="de-CH"/>
-              </w:rPr>
-              <w:t>Y</w:t>
-            </w:r>
-            <w:r>
-              <w:rPr>
-                <w:lang w:val="de-CH"/>
-              </w:rPr>
-              <w:t>ear</w:t>
-            </w:r>
-          </w:p>
-        </w:tc>
-        <w:tc>
-          <w:tcPr>
-            <w:tcW w:w="0" w:type="auto"/>
-            <w:vAlign w:val="center"/>
-            <w:hideMark/>
-          </w:tcPr>
-          <w:p>
-            <w:pPr>
-              <w:pStyle w:val="StandardohneAbstand"/>
-              <w:rPr>
-                <w:lang w:val="de-CH"/>
-              </w:rPr>
-            </w:pPr>
-            <w:r>
-              <w:rPr>
-                <w:lang w:val="de-CH"/>
-              </w:rPr>
-              <w:t xml:space="preserve">Time </w:t>
-            </w:r>
-            <w:proofErr w:type="spellStart"/>
-            <w:r>
-              <w:rPr>
-                <w:lang w:val="de-CH"/>
-              </w:rPr>
-              <w:t>identification</w:t>
-            </w:r>
-            <w:proofErr w:type="spellEnd"/>
           </w:p>
         </w:tc>
       </w:tr>
@@ -1522,7 +1455,7 @@
 </file>
 
 <file path=word/endnotes.xml><?xml version="1.0" encoding="utf-8"?>
-<w:endnotes xmlns:wpc="http://schemas.microsoft.com/office/word/2010/wordprocessingCanvas" xmlns:cx="http://schemas.microsoft.com/office/drawing/2014/chartex" xmlns:cx1="http://schemas.microsoft.com/office/drawing/2015/9/8/chartex" xmlns:cx2="http://schemas.microsoft.com/office/drawing/2015/10/21/chartex" xmlns:cx3="http://schemas.microsoft.com/office/drawing/2016/5/9/chartex" xmlns:cx4="http://schemas.microsoft.com/office/drawing/2016/5/10/chartex" xmlns:cx5="http://schemas.microsoft.com/office/drawing/2016/5/11/chartex" xmlns:cx6="http://schemas.microsoft.com/office/drawing/2016/5/12/chartex" xmlns:cx7="http://schemas.microsoft.com/office/drawing/2016/5/13/chartex" xmlns:cx8="http://schemas.microsoft.com/office/drawing/2016/5/14/chartex" xmlns:mc="http://schemas.openxmlformats.org/markup-compatibility/2006" xmlns:aink="http://schemas.microsoft.com/office/drawing/2016/ink" xmlns:am3d="http://schemas.microsoft.com/office/drawing/2017/model3d" xmlns:o="urn:schemas-microsoft-com:office:office" xmlns:oel="http://schemas.microsoft.com/office/2019/extlst" xmlns:r="http://schemas.openxmlformats.org/officeDocument/2006/relationships" xmlns:m="http://schemas.openxmlformats.org/officeDocument/2006/math" xmlns:v="urn:schemas-microsoft-com:vml" xmlns:wp14="http://schemas.microsoft.com/office/word/2010/wordprocessingDrawing" xmlns:wp="http://schemas.openxmlformats.org/drawingml/2006/wordprocessingDrawing" xmlns:w10="urn:schemas-microsoft-com:office:word" xmlns:w="http://schemas.openxmlformats.org/wordprocessingml/2006/main" xmlns:w14="http://schemas.microsoft.com/office/word/2010/wordml" xmlns:w15="http://schemas.microsoft.com/office/word/2012/wordml" xmlns:w16cex="http://schemas.microsoft.com/office/word/2018/wordml/cex" xmlns:w16cid="http://schemas.microsoft.com/office/word/2016/wordml/cid" xmlns:w16="http://schemas.microsoft.com/office/word/2018/wordml" xmlns:w16du="http://schemas.microsoft.com/office/word/2023/wordml/word16du" xmlns:w16sdtdh="http://schemas.microsoft.com/office/word/2020/wordml/sdtdatahash" xmlns:w16sdtfl="http://schemas.microsoft.com/office/word/2024/wordml/sdtformatlock" xmlns:w16se="http://schemas.microsoft.com/office/word/2015/wordml/symex" xmlns:wpg="http://schemas.microsoft.com/office/word/2010/wordprocessingGroup" xmlns:wpi="http://schemas.microsoft.com/office/word/2010/wordprocessingInk" xmlns:wne="http://schemas.microsoft.com/office/word/2006/wordml" xmlns:wps="http://schemas.microsoft.com/office/word/2010/wordprocessingShape" mc:Ignorable="w14 w15 w16se w16cid w16 w16cex w16sdtdh w16sdtfl w16du wp14">
+<w:endnotes xmlns:wpc="http://schemas.microsoft.com/office/word/2010/wordprocessingCanvas" xmlns:cx="http://schemas.microsoft.com/office/drawing/2014/chartex" xmlns:cx1="http://schemas.microsoft.com/office/drawing/2015/9/8/chartex" xmlns:cx2="http://schemas.microsoft.com/office/drawing/2015/10/21/chartex" xmlns:cx3="http://schemas.microsoft.com/office/drawing/2016/5/9/chartex" xmlns:cx4="http://schemas.microsoft.com/office/drawing/2016/5/10/chartex" xmlns:cx5="http://schemas.microsoft.com/office/drawing/2016/5/11/chartex" xmlns:cx6="http://schemas.microsoft.com/office/drawing/2016/5/12/chartex" xmlns:cx7="http://schemas.microsoft.com/office/drawing/2016/5/13/chartex" xmlns:cx8="http://schemas.microsoft.com/office/drawing/2016/5/14/chartex" xmlns:mc="http://schemas.openxmlformats.org/markup-compatibility/2006" xmlns:aink="http://schemas.microsoft.com/office/drawing/2016/ink" xmlns:am3d="http://schemas.microsoft.com/office/drawing/2017/model3d" xmlns:o="urn:schemas-microsoft-com:office:office" xmlns:oel="http://schemas.microsoft.com/office/2019/extlst" xmlns:r="http://schemas.openxmlformats.org/officeDocument/2006/relationships" xmlns:m="http://schemas.openxmlformats.org/officeDocument/2006/math" xmlns:v="urn:schemas-microsoft-com:vml" xmlns:wp14="http://schemas.microsoft.com/office/word/2010/wordprocessingDrawing" xmlns:wp="http://schemas.openxmlformats.org/drawingml/2006/wordprocessingDrawing" xmlns:w10="urn:schemas-microsoft-com:office:word" xmlns:w="http://schemas.openxmlformats.org/wordprocessingml/2006/main" xmlns:w14="http://schemas.microsoft.com/office/word/2010/wordml" xmlns:w15="http://schemas.microsoft.com/office/word/2012/wordml" xmlns:w16cei="http://schemas.microsoft.com/office/word/2026/wordml/cei" xmlns:w16cex="http://schemas.microsoft.com/office/word/2018/wordml/cex" xmlns:w16cid="http://schemas.microsoft.com/office/word/2016/wordml/cid" xmlns:w16="http://schemas.microsoft.com/office/word/2018/wordml" xmlns:w16du="http://schemas.microsoft.com/office/word/2023/wordml/word16du" xmlns:w16sdtdh="http://schemas.microsoft.com/office/word/2020/wordml/sdtdatahash" xmlns:w16sdtfl="http://schemas.microsoft.com/office/word/2024/wordml/sdtformatlock" xmlns:w16se="http://schemas.microsoft.com/office/word/2015/wordml/symex" xmlns:wpg="http://schemas.microsoft.com/office/word/2010/wordprocessingGroup" xmlns:wpi="http://schemas.microsoft.com/office/word/2010/wordprocessingInk" xmlns:wne="http://schemas.microsoft.com/office/word/2006/wordml" xmlns:wps="http://schemas.microsoft.com/office/word/2010/wordprocessingShape" mc:Ignorable="w14 w15 w16se w16cid w16 w16cex w16sdtdh w16sdtfl w16du wp14">
   <w:endnote w:type="separator" w:id="-1">
     <w:p>
       <w:r>
@@ -1543,7 +1476,7 @@
 </file>
 
 <file path=word/footnotes.xml><?xml version="1.0" encoding="utf-8"?>
-<w:footnotes xmlns:wpc="http://schemas.microsoft.com/office/word/2010/wordprocessingCanvas" xmlns:cx="http://schemas.microsoft.com/office/drawing/2014/chartex" xmlns:cx1="http://schemas.microsoft.com/office/drawing/2015/9/8/chartex" xmlns:cx2="http://schemas.microsoft.com/office/drawing/2015/10/21/chartex" xmlns:cx3="http://schemas.microsoft.com/office/drawing/2016/5/9/chartex" xmlns:cx4="http://schemas.microsoft.com/office/drawing/2016/5/10/chartex" xmlns:cx5="http://schemas.microsoft.com/office/drawing/2016/5/11/chartex" xmlns:cx6="http://schemas.microsoft.com/office/drawing/2016/5/12/chartex" xmlns:cx7="http://schemas.microsoft.com/office/drawing/2016/5/13/chartex" xmlns:cx8="http://schemas.microsoft.com/office/drawing/2016/5/14/chartex" xmlns:mc="http://schemas.openxmlformats.org/markup-compatibility/2006" xmlns:aink="http://schemas.microsoft.com/office/drawing/2016/ink" xmlns:am3d="http://schemas.microsoft.com/office/drawing/2017/model3d" xmlns:o="urn:schemas-microsoft-com:office:office" xmlns:oel="http://schemas.microsoft.com/office/2019/extlst" xmlns:r="http://schemas.openxmlformats.org/officeDocument/2006/relationships" xmlns:m="http://schemas.openxmlformats.org/officeDocument/2006/math" xmlns:v="urn:schemas-microsoft-com:vml" xmlns:wp14="http://schemas.microsoft.com/office/word/2010/wordprocessingDrawing" xmlns:wp="http://schemas.openxmlformats.org/drawingml/2006/wordprocessingDrawing" xmlns:w10="urn:schemas-microsoft-com:office:word" xmlns:w="http://schemas.openxmlformats.org/wordprocessingml/2006/main" xmlns:w14="http://schemas.microsoft.com/office/word/2010/wordml" xmlns:w15="http://schemas.microsoft.com/office/word/2012/wordml" xmlns:w16cex="http://schemas.microsoft.com/office/word/2018/wordml/cex" xmlns:w16cid="http://schemas.microsoft.com/office/word/2016/wordml/cid" xmlns:w16="http://schemas.microsoft.com/office/word/2018/wordml" xmlns:w16du="http://schemas.microsoft.com/office/word/2023/wordml/word16du" xmlns:w16sdtdh="http://schemas.microsoft.com/office/word/2020/wordml/sdtdatahash" xmlns:w16sdtfl="http://schemas.microsoft.com/office/word/2024/wordml/sdtformatlock" xmlns:w16se="http://schemas.microsoft.com/office/word/2015/wordml/symex" xmlns:wpg="http://schemas.microsoft.com/office/word/2010/wordprocessingGroup" xmlns:wpi="http://schemas.microsoft.com/office/word/2010/wordprocessingInk" xmlns:wne="http://schemas.microsoft.com/office/word/2006/wordml" xmlns:wps="http://schemas.microsoft.com/office/word/2010/wordprocessingShape" mc:Ignorable="w14 w15 w16se w16cid w16 w16cex w16sdtdh w16sdtfl w16du wp14">
+<w:footnotes xmlns:wpc="http://schemas.microsoft.com/office/word/2010/wordprocessingCanvas" xmlns:cx="http://schemas.microsoft.com/office/drawing/2014/chartex" xmlns:cx1="http://schemas.microsoft.com/office/drawing/2015/9/8/chartex" xmlns:cx2="http://schemas.microsoft.com/office/drawing/2015/10/21/chartex" xmlns:cx3="http://schemas.microsoft.com/office/drawing/2016/5/9/chartex" xmlns:cx4="http://schemas.microsoft.com/office/drawing/2016/5/10/chartex" xmlns:cx5="http://schemas.microsoft.com/office/drawing/2016/5/11/chartex" xmlns:cx6="http://schemas.microsoft.com/office/drawing/2016/5/12/chartex" xmlns:cx7="http://schemas.microsoft.com/office/drawing/2016/5/13/chartex" xmlns:cx8="http://schemas.microsoft.com/office/drawing/2016/5/14/chartex" xmlns:mc="http://schemas.openxmlformats.org/markup-compatibility/2006" xmlns:aink="http://schemas.microsoft.com/office/drawing/2016/ink" xmlns:am3d="http://schemas.microsoft.com/office/drawing/2017/model3d" xmlns:o="urn:schemas-microsoft-com:office:office" xmlns:oel="http://schemas.microsoft.com/office/2019/extlst" xmlns:r="http://schemas.openxmlformats.org/officeDocument/2006/relationships" xmlns:m="http://schemas.openxmlformats.org/officeDocument/2006/math" xmlns:v="urn:schemas-microsoft-com:vml" xmlns:wp14="http://schemas.microsoft.com/office/word/2010/wordprocessingDrawing" xmlns:wp="http://schemas.openxmlformats.org/drawingml/2006/wordprocessingDrawing" xmlns:w10="urn:schemas-microsoft-com:office:word" xmlns:w="http://schemas.openxmlformats.org/wordprocessingml/2006/main" xmlns:w14="http://schemas.microsoft.com/office/word/2010/wordml" xmlns:w15="http://schemas.microsoft.com/office/word/2012/wordml" xmlns:w16cei="http://schemas.microsoft.com/office/word/2026/wordml/cei" xmlns:w16cex="http://schemas.microsoft.com/office/word/2018/wordml/cex" xmlns:w16cid="http://schemas.microsoft.com/office/word/2016/wordml/cid" xmlns:w16="http://schemas.microsoft.com/office/word/2018/wordml" xmlns:w16du="http://schemas.microsoft.com/office/word/2023/wordml/word16du" xmlns:w16sdtdh="http://schemas.microsoft.com/office/word/2020/wordml/sdtdatahash" xmlns:w16sdtfl="http://schemas.microsoft.com/office/word/2024/wordml/sdtformatlock" xmlns:w16se="http://schemas.microsoft.com/office/word/2015/wordml/symex" xmlns:wpg="http://schemas.microsoft.com/office/word/2010/wordprocessingGroup" xmlns:wpi="http://schemas.microsoft.com/office/word/2010/wordprocessingInk" xmlns:wne="http://schemas.microsoft.com/office/word/2006/wordml" xmlns:wps="http://schemas.microsoft.com/office/word/2010/wordprocessingShape" mc:Ignorable="w14 w15 w16se w16cid w16 w16cex w16sdtdh w16sdtfl w16du wp14">
   <w:footnote w:type="separator" w:id="-1">
     <w:p>
       <w:r>
@@ -1564,7 +1497,7 @@
 </file>
 
 <file path=word/numbering.xml><?xml version="1.0" encoding="utf-8"?>
-<w:numbering xmlns:wpc="http://schemas.microsoft.com/office/word/2010/wordprocessingCanvas" xmlns:cx="http://schemas.microsoft.com/office/drawing/2014/chartex" xmlns:cx1="http://schemas.microsoft.com/office/drawing/2015/9/8/chartex" xmlns:cx2="http://schemas.microsoft.com/office/drawing/2015/10/21/chartex" xmlns:cx3="http://schemas.microsoft.com/office/drawing/2016/5/9/chartex" xmlns:cx4="http://schemas.microsoft.com/office/drawing/2016/5/10/chartex" xmlns:cx5="http://schemas.microsoft.com/office/drawing/2016/5/11/chartex" xmlns:cx6="http://schemas.microsoft.com/office/drawing/2016/5/12/chartex" xmlns:cx7="http://schemas.microsoft.com/office/drawing/2016/5/13/chartex" xmlns:cx8="http://schemas.microsoft.com/office/drawing/2016/5/14/chartex" xmlns:mc="http://schemas.openxmlformats.org/markup-compatibility/2006" xmlns:aink="http://schemas.microsoft.com/office/drawing/2016/ink" xmlns:am3d="http://schemas.microsoft.com/office/drawing/2017/model3d" xmlns:o="urn:schemas-microsoft-com:office:office" xmlns:oel="http://schemas.microsoft.com/office/2019/extlst" xmlns:r="http://schemas.openxmlformats.org/officeDocument/2006/relationships" xmlns:m="http://schemas.openxmlformats.org/officeDocument/2006/math" xmlns:v="urn:schemas-microsoft-com:vml" xmlns:wp14="http://schemas.microsoft.com/office/word/2010/wordprocessingDrawing" xmlns:wp="http://schemas.openxmlformats.org/drawingml/2006/wordprocessingDrawing" xmlns:w10="urn:schemas-microsoft-com:office:word" xmlns:w="http://schemas.openxmlformats.org/wordprocessingml/2006/main" xmlns:w14="http://schemas.microsoft.com/office/word/2010/wordml" xmlns:w15="http://schemas.microsoft.com/office/word/2012/wordml" xmlns:w16cex="http://schemas.microsoft.com/office/word/2018/wordml/cex" xmlns:w16cid="http://schemas.microsoft.com/office/word/2016/wordml/cid" xmlns:w16="http://schemas.microsoft.com/office/word/2018/wordml" xmlns:w16du="http://schemas.microsoft.com/office/word/2023/wordml/word16du" xmlns:w16sdtdh="http://schemas.microsoft.com/office/word/2020/wordml/sdtdatahash" xmlns:w16sdtfl="http://schemas.microsoft.com/office/word/2024/wordml/sdtformatlock" xmlns:w16se="http://schemas.microsoft.com/office/word/2015/wordml/symex" xmlns:wpg="http://schemas.microsoft.com/office/word/2010/wordprocessingGroup" xmlns:wpi="http://schemas.microsoft.com/office/word/2010/wordprocessingInk" xmlns:wne="http://schemas.microsoft.com/office/word/2006/wordml" xmlns:wps="http://schemas.microsoft.com/office/word/2010/wordprocessingShape" mc:Ignorable="w14 w15 w16se w16cid w16 w16cex w16sdtdh w16sdtfl w16du wp14">
+<w:numbering xmlns:wpc="http://schemas.microsoft.com/office/word/2010/wordprocessingCanvas" xmlns:cx="http://schemas.microsoft.com/office/drawing/2014/chartex" xmlns:cx1="http://schemas.microsoft.com/office/drawing/2015/9/8/chartex" xmlns:cx2="http://schemas.microsoft.com/office/drawing/2015/10/21/chartex" xmlns:cx3="http://schemas.microsoft.com/office/drawing/2016/5/9/chartex" xmlns:cx4="http://schemas.microsoft.com/office/drawing/2016/5/10/chartex" xmlns:cx5="http://schemas.microsoft.com/office/drawing/2016/5/11/chartex" xmlns:cx6="http://schemas.microsoft.com/office/drawing/2016/5/12/chartex" xmlns:cx7="http://schemas.microsoft.com/office/drawing/2016/5/13/chartex" xmlns:cx8="http://schemas.microsoft.com/office/drawing/2016/5/14/chartex" xmlns:mc="http://schemas.openxmlformats.org/markup-compatibility/2006" xmlns:aink="http://schemas.microsoft.com/office/drawing/2016/ink" xmlns:am3d="http://schemas.microsoft.com/office/drawing/2017/model3d" xmlns:o="urn:schemas-microsoft-com:office:office" xmlns:oel="http://schemas.microsoft.com/office/2019/extlst" xmlns:r="http://schemas.openxmlformats.org/officeDocument/2006/relationships" xmlns:m="http://schemas.openxmlformats.org/officeDocument/2006/math" xmlns:v="urn:schemas-microsoft-com:vml" xmlns:wp14="http://schemas.microsoft.com/office/word/2010/wordprocessingDrawing" xmlns:wp="http://schemas.openxmlformats.org/drawingml/2006/wordprocessingDrawing" xmlns:w10="urn:schemas-microsoft-com:office:word" xmlns:w="http://schemas.openxmlformats.org/wordprocessingml/2006/main" xmlns:w14="http://schemas.microsoft.com/office/word/2010/wordml" xmlns:w15="http://schemas.microsoft.com/office/word/2012/wordml" xmlns:w16cei="http://schemas.microsoft.com/office/word/2026/wordml/cei" xmlns:w16cex="http://schemas.microsoft.com/office/word/2018/wordml/cex" xmlns:w16cid="http://schemas.microsoft.com/office/word/2016/wordml/cid" xmlns:w16="http://schemas.microsoft.com/office/word/2018/wordml" xmlns:w16du="http://schemas.microsoft.com/office/word/2023/wordml/word16du" xmlns:w16sdtdh="http://schemas.microsoft.com/office/word/2020/wordml/sdtdatahash" xmlns:w16sdtfl="http://schemas.microsoft.com/office/word/2024/wordml/sdtformatlock" xmlns:w16se="http://schemas.microsoft.com/office/word/2015/wordml/symex" xmlns:wpg="http://schemas.microsoft.com/office/word/2010/wordprocessingGroup" xmlns:wpi="http://schemas.microsoft.com/office/word/2010/wordprocessingInk" xmlns:wne="http://schemas.microsoft.com/office/word/2006/wordml" xmlns:wps="http://schemas.microsoft.com/office/word/2010/wordprocessingShape" mc:Ignorable="w14 w15 w16se w16cid w16 w16cex w16sdtdh w16sdtfl w16du wp14">
   <w:abstractNum w:abstractNumId="0" w15:restartNumberingAfterBreak="0">
     <w:nsid w:val="0BD2389E"/>
     <w:multiLevelType w:val="multilevel"/>
@@ -2684,6 +2617,7 @@
   <w:style w:type="character" w:default="1" w:styleId="DefaultParagraphFont">
     <w:name w:val="Default Paragraph Font"/>
     <w:uiPriority w:val="1"/>
+    <w:semiHidden/>
     <w:unhideWhenUsed/>
   </w:style>
   <w:style w:type="table" w:default="1" w:styleId="TableNormal">
@@ -3666,10 +3600,6 @@
 </file>
 
 <file path=customXml/item1.xml><?xml version="1.0" encoding="utf-8"?>
-<b:Sources xmlns:b="http://schemas.openxmlformats.org/officeDocument/2006/bibliography" xmlns="http://schemas.openxmlformats.org/officeDocument/2006/bibliography" SelectedStyle="\APASixthEditionOfficeOnline.xsl" StyleName="APA" Version="6"/>
-</file>
-
-<file path=customXml/item2.xml><?xml version="1.0" encoding="utf-8"?>
 <ct:contentTypeSchema xmlns:ct="http://schemas.microsoft.com/office/2006/metadata/contentType" xmlns:ma="http://schemas.microsoft.com/office/2006/metadata/properties/metaAttributes" ct:_="" ma:_="" ma:contentTypeName="Dokument" ma:contentTypeID="0x01010034C2EED3AEDAB24AB48AF05A7A255DF4" ma:contentTypeVersion="20" ma:contentTypeDescription="Ein neues Dokument erstellen." ma:contentTypeScope="" ma:versionID="801b490b27e9573c13161681ba9bcef9">
   <xsd:schema xmlns:xsd="http://www.w3.org/2001/XMLSchema" xmlns:xs="http://www.w3.org/2001/XMLSchema" xmlns:p="http://schemas.microsoft.com/office/2006/metadata/properties" xmlns:ns2="07c8a24f-8b40-44ca-950f-ae5db2c4fa23" xmlns:ns3="71d337dc-809a-4269-a690-d6cd31b4acd0" targetNamespace="http://schemas.microsoft.com/office/2006/metadata/properties" ma:root="true" ma:fieldsID="f944d40614e88ef74fdd27050b1b40d4" ns2:_="" ns3:_="">
     <xsd:import namespace="07c8a24f-8b40-44ca-950f-ae5db2c4fa23"/>
@@ -3912,24 +3842,11 @@
 </ct:contentTypeSchema>
 </file>
 
-<file path=customXml/item3.xml><?xml version="1.0" encoding="utf-8"?>
-<TemplafyFormConfiguration><![CDATA[{"formFields":[],"formDataEntries":[]}]]></TemplafyFormConfiguration>
+<file path=customXml/item2.xml><?xml version="1.0" encoding="utf-8"?>
+<b:Sources xmlns:b="http://schemas.openxmlformats.org/officeDocument/2006/bibliography" xmlns="http://schemas.openxmlformats.org/officeDocument/2006/bibliography" SelectedStyle="\APASixthEditionOfficeOnline.xsl" StyleName="APA" Version="6"/>
 </file>
 
-<file path=customXml/item4.xml><?xml version="1.0" encoding="utf-8"?>
-<TemplafyTemplateConfiguration><![CDATA[{"elementsMetadata":[],"transformationConfigurations":[{"language":"{{UserProfile.DocumentLanguage.Language}}","disableUpdates":false,"type":"proofingLanguage"},{"propertyName":"creator","propertyValue":"{{UserProfile.FirstName}} {{UserProfile.LastName}}","disableUpdates":false,"type":"documentProperty"}],"templateName":"Blank document","templateDescription":"","enableDocumentContentUpdater":true,"version":"2.0"}]]></TemplafyTemplateConfiguration>
-</file>
-
-<file path=customXml/item5.xml><?xml version="1.0" encoding="utf-8"?>
-<?mso-contentType ?>
-<FormTemplates xmlns="http://schemas.microsoft.com/sharepoint/v3/contenttype/forms">
-  <Display>DocumentLibraryForm</Display>
-  <Edit>DocumentLibraryForm</Edit>
-  <New>DocumentLibraryForm</New>
-</FormTemplates>
-</file>
-
-<file path=customXml/item6.xml><?xml version="1.0" encoding="utf-8"?>
+<file path=customXml/item3.xml><?xml version="1.0" encoding="utf-8"?>
 <p:properties xmlns:p="http://schemas.microsoft.com/office/2006/metadata/properties" xmlns:xsi="http://www.w3.org/2001/XMLSchema-instance" xmlns:pc="http://schemas.microsoft.com/office/infopath/2007/PartnerControls">
   <documentManagement>
     <lcf76f155ced4ddcb4097134ff3c332f xmlns="07c8a24f-8b40-44ca-950f-ae5db2c4fa23">
@@ -3940,15 +3857,24 @@
 </p:properties>
 </file>
 
-<file path=customXml/itemProps1.xml><?xml version="1.0" encoding="utf-8"?>
-<ds:datastoreItem xmlns:ds="http://schemas.openxmlformats.org/officeDocument/2006/customXml" ds:itemID="{DCA57B62-5710-4DF4-8C56-32AF1ABA202C}">
-  <ds:schemaRefs>
-    <ds:schemaRef ds:uri="http://schemas.openxmlformats.org/officeDocument/2006/bibliography"/>
-  </ds:schemaRefs>
-</ds:datastoreItem>
+<file path=customXml/item4.xml><?xml version="1.0" encoding="utf-8"?>
+<?mso-contentType ?>
+<FormTemplates xmlns="http://schemas.microsoft.com/sharepoint/v3/contenttype/forms">
+  <Display>DocumentLibraryForm</Display>
+  <Edit>DocumentLibraryForm</Edit>
+  <New>DocumentLibraryForm</New>
+</FormTemplates>
 </file>
 
-<file path=customXml/itemProps2.xml><?xml version="1.0" encoding="utf-8"?>
+<file path=customXml/item5.xml><?xml version="1.0" encoding="utf-8"?>
+<TemplafyTemplateConfiguration><![CDATA[{"elementsMetadata":[],"transformationConfigurations":[{"language":"{{UserProfile.DocumentLanguage.Language}}","disableUpdates":false,"type":"proofingLanguage"},{"propertyName":"creator","propertyValue":"{{UserProfile.FirstName}} {{UserProfile.LastName}}","disableUpdates":false,"type":"documentProperty"}],"templateName":"Blank document","templateDescription":"","enableDocumentContentUpdater":true,"version":"2.0"}]]></TemplafyTemplateConfiguration>
+</file>
+
+<file path=customXml/item6.xml><?xml version="1.0" encoding="utf-8"?>
+<TemplafyFormConfiguration><![CDATA[{"formFields":[],"formDataEntries":[]}]]></TemplafyFormConfiguration>
+</file>
+
+<file path=customXml/itemProps1.xml><?xml version="1.0" encoding="utf-8"?>
 <ds:datastoreItem xmlns:ds="http://schemas.openxmlformats.org/officeDocument/2006/customXml" ds:itemID="{957FD9E3-2219-447B-A73C-1B487245DB96}">
   <ds:schemaRefs>
     <ds:schemaRef ds:uri="http://schemas.microsoft.com/office/2006/metadata/contentType"/>
@@ -3967,27 +3893,15 @@
 </ds:datastoreItem>
 </file>
 
-<file path=customXml/itemProps3.xml><?xml version="1.0" encoding="utf-8"?>
-<ds:datastoreItem xmlns:ds="http://schemas.openxmlformats.org/officeDocument/2006/customXml" ds:itemID="{54814BFD-24A7-4CC8-AE23-C207DFE5A637}">
-  <ds:schemaRefs/>
-</ds:datastoreItem>
-</file>
-
-<file path=customXml/itemProps4.xml><?xml version="1.0" encoding="utf-8"?>
-<ds:datastoreItem xmlns:ds="http://schemas.openxmlformats.org/officeDocument/2006/customXml" ds:itemID="{9BA7F312-830A-42FC-88BF-400E372AE0CB}">
-  <ds:schemaRefs/>
-</ds:datastoreItem>
-</file>
-
-<file path=customXml/itemProps5.xml><?xml version="1.0" encoding="utf-8"?>
-<ds:datastoreItem xmlns:ds="http://schemas.openxmlformats.org/officeDocument/2006/customXml" ds:itemID="{66094559-556F-4701-B77A-EC8F12689B77}">
+<file path=customXml/itemProps2.xml><?xml version="1.0" encoding="utf-8"?>
+<ds:datastoreItem xmlns:ds="http://schemas.openxmlformats.org/officeDocument/2006/customXml" ds:itemID="{DCA57B62-5710-4DF4-8C56-32AF1ABA202C}">
   <ds:schemaRefs>
-    <ds:schemaRef ds:uri="http://schemas.microsoft.com/sharepoint/v3/contenttype/forms"/>
+    <ds:schemaRef ds:uri="http://schemas.openxmlformats.org/officeDocument/2006/bibliography"/>
   </ds:schemaRefs>
 </ds:datastoreItem>
 </file>
 
-<file path=customXml/itemProps6.xml><?xml version="1.0" encoding="utf-8"?>
+<file path=customXml/itemProps3.xml><?xml version="1.0" encoding="utf-8"?>
 <ds:datastoreItem xmlns:ds="http://schemas.openxmlformats.org/officeDocument/2006/customXml" ds:itemID="{3F602D96-6183-4CC8-AACB-006A5546A54E}">
   <ds:schemaRefs>
     <ds:schemaRef ds:uri="http://schemas.microsoft.com/office/2006/metadata/properties"/>
@@ -3996,4 +3910,24 @@
     <ds:schemaRef ds:uri="71d337dc-809a-4269-a690-d6cd31b4acd0"/>
   </ds:schemaRefs>
 </ds:datastoreItem>
+</file>
+
+<file path=customXml/itemProps4.xml><?xml version="1.0" encoding="utf-8"?>
+<ds:datastoreItem xmlns:ds="http://schemas.openxmlformats.org/officeDocument/2006/customXml" ds:itemID="{66094559-556F-4701-B77A-EC8F12689B77}">
+  <ds:schemaRefs>
+    <ds:schemaRef ds:uri="http://schemas.microsoft.com/sharepoint/v3/contenttype/forms"/>
+  </ds:schemaRefs>
+</ds:datastoreItem>
+</file>
+
+<file path=customXml/itemProps5.xml><?xml version="1.0" encoding="utf-8"?>
+<ds:datastoreItem xmlns:ds="http://schemas.openxmlformats.org/officeDocument/2006/customXml" ds:itemID="{9BA7F312-830A-42FC-88BF-400E372AE0CB}">
+  <ds:schemaRefs/>
+</ds:datastoreItem>
+</file>
+
+<file path=customXml/itemProps6.xml><?xml version="1.0" encoding="utf-8"?>
+<ds:datastoreItem xmlns:ds="http://schemas.openxmlformats.org/officeDocument/2006/customXml" ds:itemID="{54814BFD-24A7-4CC8-AE23-C207DFE5A637}">
+  <ds:schemaRefs/>
+</ds:datastoreItem>
 </file>
</xml_diff>